<commit_message>
添加 EHA 复位时的 sendData(169, 0) 调用
</commit_message>
<xml_diff>
--- a/AEScontrol标定.docx
+++ b/AEScontrol标定.docx
@@ -31,7 +31,19 @@
         <w:rPr>
           <w:rFonts w:hint="eastAsia"/>
         </w:rPr>
-        <w:t>1.机器人控制——浮动电主轴数值悬空置于标定台压力传感器上方</w:t>
+        <w:t>1.机器人控制——浮动电主轴</w:t>
+      </w:r>
+      <w:r>
+        <w:rPr>
+          <w:rFonts w:hint="eastAsia"/>
+        </w:rPr>
+        <w:t>竖直</w:t>
+      </w:r>
+      <w:r>
+        <w:rPr>
+          <w:rFonts w:hint="eastAsia"/>
+        </w:rPr>
+        <w:t>悬空置于标定台压力传感器上方</w:t>
       </w:r>
     </w:p>
     <w:p>
@@ -608,6 +620,24 @@
         </w:rPr>
         <w:t>7.机器人操作——设备抬起后 调整为水平状态</w:t>
       </w:r>
+      <w:r>
+        <w:rPr>
+          <w:rFonts w:hint="eastAsia"/>
+        </w:rPr>
+        <w:t>(浮动模块数显屏为0</w:t>
+      </w:r>
+      <w:r>
+        <w:rPr>
+          <w:rFonts w:hint="eastAsia"/>
+        </w:rPr>
+        <w:t>或99</w:t>
+      </w:r>
+      <w:r>
+        <w:rPr>
+          <w:rFonts w:hint="eastAsia"/>
+        </w:rPr>
+        <w:t>)</w:t>
+      </w:r>
     </w:p>
     <w:p>
       <w:pPr>
@@ -622,7 +652,7 @@
           <w:noProof/>
         </w:rPr>
         <w:drawing>
-          <wp:inline distT="0" distB="0" distL="0" distR="0" wp14:anchorId="5C652FB5" wp14:editId="54655C07">
+          <wp:inline distT="0" distB="0" distL="0" distR="0" wp14:anchorId="5C652FB5" wp14:editId="6F164B6D">
             <wp:extent cx="3710211" cy="2977271"/>
             <wp:effectExtent l="0" t="0" r="5080" b="0"/>
             <wp:docPr id="2004256404" name="图片 3"/>
@@ -822,21 +852,7 @@
         <w:rPr>
           <w:rFonts w:hint="eastAsia"/>
         </w:rPr>
-        <w:t>切换模式后录入的质量会失效 需要通过</w:t>
-      </w:r>
-      <w:proofErr w:type="spellStart"/>
-      <w:r>
-        <w:rPr>
-          <w:rFonts w:hint="eastAsia"/>
-        </w:rPr>
-        <w:t>Ethercat</w:t>
-      </w:r>
-      <w:proofErr w:type="spellEnd"/>
-      <w:r>
-        <w:rPr>
-          <w:rFonts w:hint="eastAsia"/>
-        </w:rPr>
-        <w:t>录入之前标定得到的质量</w:t>
+        <w:t>切换模式后录入的质量会失效 需要通过Ethercat录入之前标定得到的质量</w:t>
       </w:r>
     </w:p>
     <w:sectPr>

</xml_diff>